<commit_message>
refactor: ship the retrosynthesis model as a minimal package with a CPU dry run
Drop the benchmark script and its derived metric files; the retro part now
consists only of the two checkpoints, the minimal load/predict code and the
precursor library. tools/retro_dry_run.py verifies checkpoint hashes and
predicts on CPU; install.sh --retro installs the CPU torch wheel by default
(GOAI_TORCH_INDEX overrides) so the dry run works in a clean environment.
Metrics in the report, deck and SUBMISSION.md are attributed to the shipped
checkpoint evaluation summaries instead of an in-repo recomputation.
</commit_message>
<xml_diff>
--- a/submission/goai_final/report_docx/复赛报告_SAGE-Mat.docx
+++ b/submission/goai_final/report_docx/复赛报告_SAGE-Mat.docx
@@ -189,7 +189,7 @@
           <w:color w:val="000000"/>
           <w:sz w:val="21"/>
         </w:rPr>
-        <w:t xml:space="preserve">复赛阶段在初赛方案基础上完成了三件事。第一，把初赛承诺的 LLZO 烧结致密化主题跑通为端到端诊断案例（46 篇核验文献、10 页综述、Top-5 前驱体路线），并据此修复了 11 类集成失效模式。第二，用纯主题冷启动完成正式案例 Ba5Y12Zn[O(SiO4)]8 及其结构近邻的合成条件调研：51 篇文献全部通过存在性、元数据与作者顺序三轴核验，正文 100 条结论、219 次引用、整合率 100%，两轮对抗审稿 0 blocker / 0 major，随后按材料专家 8 条意见完成学术化修订，形成 23 页正式报告。第三，将团队 NeurIPS 2026 投稿 RECIPE 的两阶段无机前驱体预测模型以 MCP 工具形式接入想法生成环节，并在 2,558 条留出测试反应上独立重算指标（Combo@1 71.81、Combo@20 89.21、Combo MRR 77.48），与 checkpoint 自带汇总逐位一致。</w:t>
+        <w:t xml:space="preserve">复赛阶段在初赛方案基础上完成了三件事。第一，把初赛承诺的 LLZO 烧结致密化主题跑通为端到端诊断案例（46 篇核验文献、10 页综述、Top-5 前驱体路线），并据此修复了 11 类集成失效模式。第二，用纯主题冷启动完成正式案例 Ba5Y12Zn[O(SiO4)]8 及其结构近邻的合成条件调研：51 篇文献全部通过存在性、元数据与作者顺序三轴核验，正文 100 条结论、219 次引用、整合率 100%，两轮对抗审稿 0 blocker / 0 major，随后按材料专家 8 条意见完成学术化修订，形成 23 页正式报告。第三，将团队 NeurIPS 2026 投稿 RECIPE 的两阶段无机前驱体预测模型以 MCP 工具形式接入想法生成环节；模型 checkpoint、最小加载与预测代码和必备原料库随包提交，其在 2,558 条留出测试反应上的评测汇总（Combo@1 71.81、Combo@20 89.21、Combo MRR 77.48）随 checkpoint 一并提交，并以 CPU dry run 保证包内模型可加载、可预测。</w:t>
       </w:r>
     </w:p>
     <w:p>
@@ -1348,7 +1348,7 @@
           <w:color w:val="000000"/>
           <w:sz w:val="21"/>
         </w:rPr>
-        <w:t xml:space="preserve">：RECIPE 两阶段模型在 Retro 留出测试集（2,558 条，2018 年后反应）上的重算，协议与论文一致（top_m 30、pool 15、集合大小 2–5、全分母）。</w:t>
+        <w:t xml:space="preserve">：RECIPE 两阶段模型在 Retro 留出测试集（2,558 条，2018 年后反应）上的评测汇总，随 checkpoint 提交（stage1_summary.json / stage2_summary.json，单种子 20260504），协议与论文一致（top_m 30、pool 15、集合大小 2–5、全分母）。</w:t>
       </w:r>
     </w:p>
     <w:p>
@@ -1808,7 +1808,7 @@
         <w:pStyle w:val="4"/>
       </w:pPr>
       <w:r>
-        <w:t>4.4 前驱体预测基准（RECIPE 融入部分的独立复核）</w:t>
+        <w:t>4.4 前驱体预测基准（RECIPE 融入部分）</w:t>
       </w:r>
     </w:p>
     <w:tbl>
@@ -1825,16 +1825,15 @@
         <w:tblLayout w:type="fixed"/>
       </w:tblPr>
       <w:tblGrid>
-        <w:gridCol w:w="2954"/>
-        <w:gridCol w:w="1569"/>
-        <w:gridCol w:w="1754"/>
-        <w:gridCol w:w="1569"/>
-        <w:gridCol w:w="2032"/>
+        <w:gridCol w:w="3512"/>
+        <w:gridCol w:w="2085"/>
+        <w:gridCol w:w="1865"/>
+        <w:gridCol w:w="2416"/>
       </w:tblGrid>
       <w:tr>
         <w:tc>
           <w:tcPr>
-            <w:tcW w:w="2954" w:type="dxa"/>
+            <w:tcW w:w="3512" w:type="dxa"/>
             <w:shd w:val="clear" w:fill="F4F6F9"/>
             <w:vAlign w:val="center"/>
           </w:tcPr>
@@ -1856,7 +1855,7 @@
         </w:tc>
         <w:tc>
           <w:tcPr>
-            <w:tcW w:w="1569" w:type="dxa"/>
+            <w:tcW w:w="2085" w:type="dxa"/>
             <w:shd w:val="clear" w:fill="F4F6F9"/>
             <w:vAlign w:val="center"/>
           </w:tcPr>
@@ -1872,35 +1871,13 @@
                 <w:color w:val="000000"/>
                 <w:sz w:val="18"/>
               </w:rPr>
-              <w:t xml:space="preserve">本仓库重算</w:t>
+              <w:t xml:space="preserve">checkpoint 评测汇总</w:t>
             </w:r>
           </w:p>
         </w:tc>
         <w:tc>
           <w:tcPr>
-            <w:tcW w:w="1754" w:type="dxa"/>
-            <w:shd w:val="clear" w:fill="F4F6F9"/>
-            <w:vAlign w:val="center"/>
-          </w:tcPr>
-          <w:p>
-            <w:pPr>
-              <w:spacing w:before="30" w:after="30"/>
-            </w:pPr>
-            <w:r>
-              <w:rPr>
-                <w:rFonts w:ascii="Calibri" w:hAnsi="Calibri" w:eastAsia="微软雅黑"/>
-                <w:b/>
-                <w:i w:val="0"/>
-                <w:color w:val="000000"/>
-                <w:sz w:val="18"/>
-              </w:rPr>
-              <w:t xml:space="preserve">checkpoint 自带汇总</w:t>
-            </w:r>
-          </w:p>
-        </w:tc>
-        <w:tc>
-          <w:tcPr>
-            <w:tcW w:w="1569" w:type="dxa"/>
+            <w:tcW w:w="1865" w:type="dxa"/>
             <w:shd w:val="clear" w:fill="F4F6F9"/>
             <w:vAlign w:val="center"/>
           </w:tcPr>
@@ -1922,7 +1899,7 @@
         </w:tc>
         <w:tc>
           <w:tcPr>
-            <w:tcW w:w="2032" w:type="dxa"/>
+            <w:tcW w:w="2416" w:type="dxa"/>
             <w:shd w:val="clear" w:fill="F4F6F9"/>
             <w:vAlign w:val="center"/>
           </w:tcPr>
@@ -1946,7 +1923,7 @@
       <w:tr>
         <w:tc>
           <w:tcPr>
-            <w:tcW w:w="2954" w:type="dxa"/>
+            <w:tcW w:w="3512" w:type="dxa"/>
             <w:vAlign w:val="center"/>
           </w:tcPr>
           <w:p>
@@ -1967,7 +1944,7 @@
         </w:tc>
         <w:tc>
           <w:tcPr>
-            <w:tcW w:w="1569" w:type="dxa"/>
+            <w:tcW w:w="2085" w:type="dxa"/>
             <w:vAlign w:val="center"/>
           </w:tcPr>
           <w:p>
@@ -1988,28 +1965,7 @@
         </w:tc>
         <w:tc>
           <w:tcPr>
-            <w:tcW w:w="1754" w:type="dxa"/>
-            <w:vAlign w:val="center"/>
-          </w:tcPr>
-          <w:p>
-            <w:pPr>
-              <w:spacing w:before="30" w:after="30"/>
-            </w:pPr>
-            <w:r>
-              <w:rPr>
-                <w:rFonts w:ascii="Calibri" w:hAnsi="Calibri" w:eastAsia="微软雅黑"/>
-                <w:b w:val="0"/>
-                <w:i w:val="0"/>
-                <w:color w:val="000000"/>
-                <w:sz w:val="18"/>
-              </w:rPr>
-              <w:t xml:space="preserve">95.78</w:t>
-            </w:r>
-          </w:p>
-        </w:tc>
-        <w:tc>
-          <w:tcPr>
-            <w:tcW w:w="1569" w:type="dxa"/>
+            <w:tcW w:w="1865" w:type="dxa"/>
             <w:vAlign w:val="center"/>
           </w:tcPr>
           <w:p>
@@ -2030,7 +1986,7 @@
         </w:tc>
         <w:tc>
           <w:tcPr>
-            <w:tcW w:w="2032" w:type="dxa"/>
+            <w:tcW w:w="2416" w:type="dxa"/>
             <w:vAlign w:val="center"/>
           </w:tcPr>
           <w:p>
@@ -2053,7 +2009,7 @@
       <w:tr>
         <w:tc>
           <w:tcPr>
-            <w:tcW w:w="2954" w:type="dxa"/>
+            <w:tcW w:w="3512" w:type="dxa"/>
             <w:vAlign w:val="center"/>
           </w:tcPr>
           <w:p>
@@ -2074,7 +2030,7 @@
         </w:tc>
         <w:tc>
           <w:tcPr>
-            <w:tcW w:w="1569" w:type="dxa"/>
+            <w:tcW w:w="2085" w:type="dxa"/>
             <w:vAlign w:val="center"/>
           </w:tcPr>
           <w:p>
@@ -2095,28 +2051,7 @@
         </w:tc>
         <w:tc>
           <w:tcPr>
-            <w:tcW w:w="1754" w:type="dxa"/>
-            <w:vAlign w:val="center"/>
-          </w:tcPr>
-          <w:p>
-            <w:pPr>
-              <w:spacing w:before="30" w:after="30"/>
-            </w:pPr>
-            <w:r>
-              <w:rPr>
-                <w:rFonts w:ascii="Calibri" w:hAnsi="Calibri" w:eastAsia="微软雅黑"/>
-                <w:b w:val="0"/>
-                <w:i w:val="0"/>
-                <w:color w:val="000000"/>
-                <w:sz w:val="18"/>
-              </w:rPr>
-              <w:t xml:space="preserve">71.81</w:t>
-            </w:r>
-          </w:p>
-        </w:tc>
-        <w:tc>
-          <w:tcPr>
-            <w:tcW w:w="1569" w:type="dxa"/>
+            <w:tcW w:w="1865" w:type="dxa"/>
             <w:vAlign w:val="center"/>
           </w:tcPr>
           <w:p>
@@ -2137,7 +2072,7 @@
         </w:tc>
         <w:tc>
           <w:tcPr>
-            <w:tcW w:w="2032" w:type="dxa"/>
+            <w:tcW w:w="2416" w:type="dxa"/>
             <w:vAlign w:val="center"/>
           </w:tcPr>
           <w:p>
@@ -2160,7 +2095,7 @@
       <w:tr>
         <w:tc>
           <w:tcPr>
-            <w:tcW w:w="2954" w:type="dxa"/>
+            <w:tcW w:w="3512" w:type="dxa"/>
             <w:vAlign w:val="center"/>
           </w:tcPr>
           <w:p>
@@ -2181,7 +2116,7 @@
         </w:tc>
         <w:tc>
           <w:tcPr>
-            <w:tcW w:w="1569" w:type="dxa"/>
+            <w:tcW w:w="2085" w:type="dxa"/>
             <w:vAlign w:val="center"/>
           </w:tcPr>
           <w:p>
@@ -2202,28 +2137,7 @@
         </w:tc>
         <w:tc>
           <w:tcPr>
-            <w:tcW w:w="1754" w:type="dxa"/>
-            <w:vAlign w:val="center"/>
-          </w:tcPr>
-          <w:p>
-            <w:pPr>
-              <w:spacing w:before="30" w:after="30"/>
-            </w:pPr>
-            <w:r>
-              <w:rPr>
-                <w:rFonts w:ascii="Calibri" w:hAnsi="Calibri" w:eastAsia="微软雅黑"/>
-                <w:b w:val="0"/>
-                <w:i w:val="0"/>
-                <w:color w:val="000000"/>
-                <w:sz w:val="18"/>
-              </w:rPr>
-              <w:t xml:space="preserve">84.71</w:t>
-            </w:r>
-          </w:p>
-        </w:tc>
-        <w:tc>
-          <w:tcPr>
-            <w:tcW w:w="1569" w:type="dxa"/>
+            <w:tcW w:w="1865" w:type="dxa"/>
             <w:vAlign w:val="center"/>
           </w:tcPr>
           <w:p>
@@ -2244,7 +2158,7 @@
         </w:tc>
         <w:tc>
           <w:tcPr>
-            <w:tcW w:w="2032" w:type="dxa"/>
+            <w:tcW w:w="2416" w:type="dxa"/>
             <w:vAlign w:val="center"/>
           </w:tcPr>
           <w:p>
@@ -2267,7 +2181,7 @@
       <w:tr>
         <w:tc>
           <w:tcPr>
-            <w:tcW w:w="2954" w:type="dxa"/>
+            <w:tcW w:w="3512" w:type="dxa"/>
             <w:vAlign w:val="center"/>
           </w:tcPr>
           <w:p>
@@ -2288,7 +2202,7 @@
         </w:tc>
         <w:tc>
           <w:tcPr>
-            <w:tcW w:w="1569" w:type="dxa"/>
+            <w:tcW w:w="2085" w:type="dxa"/>
             <w:vAlign w:val="center"/>
           </w:tcPr>
           <w:p>
@@ -2309,28 +2223,7 @@
         </w:tc>
         <w:tc>
           <w:tcPr>
-            <w:tcW w:w="1754" w:type="dxa"/>
-            <w:vAlign w:val="center"/>
-          </w:tcPr>
-          <w:p>
-            <w:pPr>
-              <w:spacing w:before="30" w:after="30"/>
-            </w:pPr>
-            <w:r>
-              <w:rPr>
-                <w:rFonts w:ascii="Calibri" w:hAnsi="Calibri" w:eastAsia="微软雅黑"/>
-                <w:b w:val="0"/>
-                <w:i w:val="0"/>
-                <w:color w:val="000000"/>
-                <w:sz w:val="18"/>
-              </w:rPr>
-              <w:t xml:space="preserve">89.21</w:t>
-            </w:r>
-          </w:p>
-        </w:tc>
-        <w:tc>
-          <w:tcPr>
-            <w:tcW w:w="1569" w:type="dxa"/>
+            <w:tcW w:w="1865" w:type="dxa"/>
             <w:vAlign w:val="center"/>
           </w:tcPr>
           <w:p>
@@ -2351,7 +2244,7 @@
         </w:tc>
         <w:tc>
           <w:tcPr>
-            <w:tcW w:w="2032" w:type="dxa"/>
+            <w:tcW w:w="2416" w:type="dxa"/>
             <w:vAlign w:val="center"/>
           </w:tcPr>
           <w:p>
@@ -2374,7 +2267,7 @@
       <w:tr>
         <w:tc>
           <w:tcPr>
-            <w:tcW w:w="2954" w:type="dxa"/>
+            <w:tcW w:w="3512" w:type="dxa"/>
             <w:vAlign w:val="center"/>
           </w:tcPr>
           <w:p>
@@ -2395,7 +2288,7 @@
         </w:tc>
         <w:tc>
           <w:tcPr>
-            <w:tcW w:w="1569" w:type="dxa"/>
+            <w:tcW w:w="2085" w:type="dxa"/>
             <w:vAlign w:val="center"/>
           </w:tcPr>
           <w:p>
@@ -2416,28 +2309,7 @@
         </w:tc>
         <w:tc>
           <w:tcPr>
-            <w:tcW w:w="1754" w:type="dxa"/>
-            <w:vAlign w:val="center"/>
-          </w:tcPr>
-          <w:p>
-            <w:pPr>
-              <w:spacing w:before="30" w:after="30"/>
-            </w:pPr>
-            <w:r>
-              <w:rPr>
-                <w:rFonts w:ascii="Calibri" w:hAnsi="Calibri" w:eastAsia="微软雅黑"/>
-                <w:b w:val="0"/>
-                <w:i w:val="0"/>
-                <w:color w:val="000000"/>
-                <w:sz w:val="18"/>
-              </w:rPr>
-              <w:t xml:space="preserve">77.48</w:t>
-            </w:r>
-          </w:p>
-        </w:tc>
-        <w:tc>
-          <w:tcPr>
-            <w:tcW w:w="1569" w:type="dxa"/>
+            <w:tcW w:w="1865" w:type="dxa"/>
             <w:vAlign w:val="center"/>
           </w:tcPr>
           <w:p>
@@ -2458,7 +2330,7 @@
         </w:tc>
         <w:tc>
           <w:tcPr>
-            <w:tcW w:w="2032" w:type="dxa"/>
+            <w:tcW w:w="2416" w:type="dxa"/>
             <w:vAlign w:val="center"/>
           </w:tcPr>
           <w:p>
@@ -2481,7 +2353,7 @@
       <w:tr>
         <w:tc>
           <w:tcPr>
-            <w:tcW w:w="2954" w:type="dxa"/>
+            <w:tcW w:w="3512" w:type="dxa"/>
             <w:vAlign w:val="center"/>
           </w:tcPr>
           <w:p>
@@ -2502,7 +2374,7 @@
         </w:tc>
         <w:tc>
           <w:tcPr>
-            <w:tcW w:w="1569" w:type="dxa"/>
+            <w:tcW w:w="2085" w:type="dxa"/>
             <w:vAlign w:val="center"/>
           </w:tcPr>
           <w:p>
@@ -2523,7 +2395,7 @@
         </w:tc>
         <w:tc>
           <w:tcPr>
-            <w:tcW w:w="1754" w:type="dxa"/>
+            <w:tcW w:w="1865" w:type="dxa"/>
             <w:vAlign w:val="center"/>
           </w:tcPr>
           <w:p>
@@ -2544,28 +2416,7 @@
         </w:tc>
         <w:tc>
           <w:tcPr>
-            <w:tcW w:w="1569" w:type="dxa"/>
-            <w:vAlign w:val="center"/>
-          </w:tcPr>
-          <w:p>
-            <w:pPr>
-              <w:spacing w:before="30" w:after="30"/>
-            </w:pPr>
-            <w:r>
-              <w:rPr>
-                <w:rFonts w:ascii="Calibri" w:hAnsi="Calibri" w:eastAsia="微软雅黑"/>
-                <w:b w:val="0"/>
-                <w:i w:val="0"/>
-                <w:color w:val="000000"/>
-                <w:sz w:val="18"/>
-              </w:rPr>
-              <w:t xml:space="preserve">11.65 / 23.24</w:t>
-            </w:r>
-          </w:p>
-        </w:tc>
-        <w:tc>
-          <w:tcPr>
-            <w:tcW w:w="2032" w:type="dxa"/>
+            <w:tcW w:w="2416" w:type="dxa"/>
             <w:vAlign w:val="center"/>
           </w:tcPr>
           <w:p>
@@ -2604,7 +2455,7 @@
           <w:color w:val="000000"/>
           <w:sz w:val="21"/>
         </w:rPr>
-        <w:t xml:space="preserve">重算使用与 MCP 工具完全相同的推理代码（tools/eval_retro_benchmark.py，GPU 19 分钟），结果与 checkpoint 自带汇总逐位一致，落在论文三种子区间内；对照行说明增益来自学习到的集合级排序而非候选枚举或过滤本身。论文中 20 例文献标注的分布外目标上，RECIPE 由 Combo@1 55.00 升至 Combo@20 85.00（Retrieval-Retro 为 40.00），与本项目"Top-1 可靠、Top-2 起需人工与文献复核"的观察一致。</w:t>
+        <w:t xml:space="preserve">逆合成部分按最小交付提交：两个 checkpoint、最小加载与预测代码（server/core/inorganic_retro.py、vendor/two_stage_retro/）和必备原料库，不另附评测脚本；表中数字来自随 checkpoint 提交的源包评测汇总（单种子 20260504），落在论文三种子区间内。tools/retro_dry_run.py 沿与 MCP 工具相同的推理路径校验 checkpoint、构建化学先验并在 CPU 上完成预测（数秒），干净环境实测 Li7La3Zr2O12 → Top-1 ZrO2 + La2O3 + Li2CO3，与正式运行记录一致。对照行说明增益来自学习到的集合级排序而非候选枚举或过滤本身。论文中 20 例文献标注的分布外目标上，RECIPE 由 Combo@1 55.00 升至 Combo@20 85.00（Retrieval-Retro 为 40.00），与本项目"Top-1 可靠、Top-2 起需人工与文献复核"的观察一致。</w:t>
       </w:r>
     </w:p>
     <w:p>
@@ -2689,7 +2540,7 @@
           <w:color w:val="000000"/>
           <w:sz w:val="21"/>
         </w:rPr>
-        <w:t xml:space="preserve">bash install.sh --retro 完成安装；bash scripts/smoke_test.sh --with-retro 在干净环境无网络、无 LLM 条件下 1–2 分钟内验证环境、4 个 MCP server、56 项测试、公开知识库、结论—证据链与图纸渲染；tools/eval_retro_benchmark.py 独立复算基准；bash scripts/reproduce_core.sh 用同一主题、同一模型与推理强度重新运行整条流水线。因 LLM 不可逐字复现，核心流程的复现判据是账本 check-done 退出 0、CITATION_AUDIT 全部 PASS、bib_guard 整合率 ≥ 90%，并产出 PDF、BibTeX、图源与逐子任务 JSONL 轨迹。报告中每个主要结论、图与指标都可沿"代码版本 → 配置 → 数据 → 日志/轨迹 → 结果文件"追溯（SUBMISSION.md §6 给出完整示例）。</w:t>
+        <w:t xml:space="preserve">bash install.sh --retro 完成安装；bash scripts/smoke_test.sh --with-retro 在干净环境无网络、无 LLM 条件下 1–2 分钟内验证环境、4 个 MCP server、56 项测试、公开知识库、结论—证据链与图纸渲染；tools/retro_dry_run.py 在 CPU 上加载模型并完成预测；bash scripts/reproduce_core.sh 用同一主题、同一模型与推理强度重新运行整条流水线。因 LLM 不可逐字复现，核心流程的复现判据是账本 check-done 退出 0、CITATION_AUDIT 全部 PASS、bib_guard 整合率 ≥ 90%，并产出 PDF、BibTeX、图源与逐子任务 JSONL 轨迹。报告中每个主要结论、图与指标都可沿"代码版本 → 配置 → 数据 → 日志/轨迹 → 结果文件"追溯（SUBMISSION.md §6 给出完整示例）。</w:t>
       </w:r>
     </w:p>
     <w:p>

</xml_diff>

<commit_message>
chore(submission): set team 科学无极 (TeamNo.13) and official title SAGE-Mat
Official title "面向无机材料发现与合成规划的证据约束自循环智能体" on the deck
cover, DOCX report and reviewer docs; deck PPTX/PDF and DOCX rebuilt; packager
writes official-category folders into both zips with an index README.
</commit_message>
<xml_diff>
--- a/submission/goai_final/report_docx/复赛报告_SAGE-Mat.docx
+++ b/submission/goai_final/report_docx/复赛报告_SAGE-Mat.docx
@@ -29,7 +29,7 @@
           <w:color w:val="5A6573"/>
           <w:sz w:val="21"/>
         </w:rPr>
-        <w:t>复赛提交：方案说明 PPT + 复赛报告（初赛问题定义文档加强版）</w:t>
+        <w:t>第13队 科学无极 · SAGE-Mat：面向无机材料发现与合成规划的证据约束自循环智能体</w:t>
       </w:r>
     </w:p>
     <w:p>
@@ -53,7 +53,7 @@
           <w:color w:val="0B2545"/>
           <w:sz w:val="19"/>
         </w:rPr>
-        <w:t xml:space="preserve">本报告为初赛问题定义文档的加强版；其中每个主要结论、图与指标均可追溯到提交包中的代码版本、配置、数据、运行日志/Agent 轨迹与结果文件（见 docs/competition/SUBMISSION.md）。</w:t>
+        <w:t xml:space="preserve">SAGE-Mat: Evidence-Constrained Self-Cyclic Agent for Inorganic Material Discovery &amp; Synthesis Planning。报告中的每个主要结论、图与指标均可追溯到提交包中的代码版本、配置、数据、运行日志与结果文件。</w:t>
       </w:r>
     </w:p>
     <w:p>
@@ -85,7 +85,7 @@
           <w:color w:val="000000"/>
           <w:sz w:val="21"/>
         </w:rPr>
-        <w:t xml:space="preserve">SAGE-Mat：面向无机材料科学发现与合成规划的证据驱动自循环智能体（开源实现名 GoAI Research）。</w:t>
+        <w:t xml:space="preserve">SAGE-Mat：面向无机材料发现与合成规划的证据约束自循环智能体（SAGE-Mat: Evidence-Constrained Self-Cyclic Agent for Inorganic Material Discovery &amp; Synthesis Planning；开源实现名 GoAI Research）。</w:t>
       </w:r>
     </w:p>
     <w:p>
@@ -109,7 +109,7 @@
           <w:color w:val="000000"/>
           <w:sz w:val="21"/>
         </w:rPr>
-        <w:t xml:space="preserve">方向三"材料科学文献驱动的科学发现智能体"，进阶路线 C"合成路线与工艺设计"。</w:t>
+        <w:t xml:space="preserve">方向三"材料科学文献驱动的科学发现智能体"（材料科学 / MaterialsScience），进阶路线 C"合成路线与工艺设计"。</w:t>
       </w:r>
     </w:p>
     <w:p>
@@ -2479,7 +2479,7 @@
           <w:color w:val="000000"/>
           <w:sz w:val="21"/>
         </w:rPr>
-        <w:t xml:space="preserve">56 项离线单元测试（BibTeX 往返、作者比对、figspec 校验与排版 lint、SVG↔draw.io 往返、本地全文库检索与受限读取、账本并发 12 写入者零丢失、check-done 语义与回执校验、bib/tex/术语闸门）全部通过；实测套件（真实五源检索、真实 draw.io 导出、完整 mini 综述回环）记录于 docs/live-tests/。</w:t>
+        <w:t xml:space="preserve">离线单元测试（BibTeX 往返、作者比对、figspec 校验与排版 lint、SVG↔draw.io 往返、本地全文库检索与受限读取、账本并发 12 写入者零丢失、check-done 语义与回执校验、bib/tex/术语闸门、提交轨迹脱敏与 JSONL 规范化）全部通过，实际测试数量由 pytest 收据给出；实测套件（真实五源检索、真实 draw.io 导出、完整 mini 综述回环）记录于 docs/live-tests/。</w:t>
       </w:r>
     </w:p>
     <w:p>
@@ -2540,7 +2540,7 @@
           <w:color w:val="000000"/>
           <w:sz w:val="21"/>
         </w:rPr>
-        <w:t xml:space="preserve">bash install.sh --retro 完成安装；bash scripts/smoke_test.sh --with-retro 在干净环境无网络、无 LLM 条件下 1–2 分钟内验证环境、4 个 MCP server、56 项测试、公开知识库、结论—证据链与图纸渲染；tools/retro_dry_run.py 在 CPU 上加载模型并完成预测；bash scripts/reproduce_core.sh 用同一主题、同一模型与推理强度重新运行整条流水线。因 LLM 不可逐字复现，核心流程的复现判据是账本 check-done 退出 0、CITATION_AUDIT 全部 PASS、bib_guard 整合率 ≥ 90%，并产出 PDF、BibTeX、图源与逐子任务 JSONL 轨迹。报告中每个主要结论、图与指标都可沿"代码版本 → 配置 → 数据 → 日志/轨迹 → 结果文件"追溯（SUBMISSION.md §6 给出完整示例）。</w:t>
+        <w:t xml:space="preserve">bash install.sh --retro 完成锁定安装；bash scripts/smoke_test.sh --with-retro 在干净环境无网络、无 LLM 条件下 1–2 分钟内验证环境、4 个 MCP server、全部离线测试、公开知识库、结论—证据链与图纸渲染；tools/retro_dry_run.py 在 CPU 上加载两个 checkpoint 并对一个参考目标完成预测；bash scripts/reproduce_core.sh 用同一主题、同一模型与推理强度重新运行整条流水线。因 LLM 不可逐字复现，核心流程的复现判据是账本 check-done 退出 0、CITATION_AUDIT 全部 PASS、bib_guard 整合率 ≥ 90%，并产出 PDF、BibTeX、图源与逐子任务 JSONL 轨迹；脚本只有在这些条件全部满足后才返回 0，并写出 REPRODUCTION_RECEIPT.json。报告中每个主要结论、图与指标都可沿"代码版本 → 配置 → 数据 → 日志/轨迹 → 结果文件"追溯（SUBMISSION.md §6 给出完整示例）。</w:t>
       </w:r>
     </w:p>
     <w:p>
@@ -2641,7 +2641,7 @@
           <w:color w:val="000000"/>
           <w:sz w:val="21"/>
         </w:rPr>
-        <w:t xml:space="preserve">团队由三名博士成员组成：高京，上海交通大学；吕丁阳，中国科学院大学；李雨峰，上海交通大学。分工覆盖材料文献理解、科学问题识别、科研智能体设计、模型训练与逆合成评价等环节。</w:t>
+        <w:t xml:space="preserve">队名科学无极，参赛编号第13队（TeamNo.13），方向材料科学（MaterialsScience）。团队由三名博士成员组成：高京，上海交通大学；吕丁阳，中国科学院大学；李雨峰，上海交通大学。分工覆盖材料文献理解、科学问题识别、科研智能体设计、模型训练与逆合成评价等环节。</w:t>
       </w:r>
     </w:p>
     <w:p>
@@ -2754,7 +2754,7 @@
         <w:color w:val="5A6573"/>
         <w:sz w:val="17"/>
       </w:rPr>
-      <w:t xml:space="preserve"> | 算法赛复赛报告 · SAGE-Mat</w:t>
+      <w:t xml:space="preserve"> | 算法赛复赛报告 · 科学无极 · SAGE-Mat</w:t>
     </w:r>
   </w:p>
 </w:ftr>

</xml_diff>